<commit_message>
minor edits to main and report
</commit_message>
<xml_diff>
--- a/Reports/Report1.docx
+++ b/Reports/Report1.docx
@@ -1,6 +1,6 @@
 
 <file path=word/document.xml><?xml version="1.0" encoding="utf-8"?>
-<w:document xmlns:wpc="http://schemas.microsoft.com/office/word/2010/wordprocessingCanvas" xmlns:cx="http://schemas.microsoft.com/office/drawing/2014/chartex" xmlns:cx1="http://schemas.microsoft.com/office/drawing/2015/9/8/chartex" xmlns:cx2="http://schemas.microsoft.com/office/drawing/2015/10/21/chartex" xmlns:cx3="http://schemas.microsoft.com/office/drawing/2016/5/9/chartex" xmlns:cx4="http://schemas.microsoft.com/office/drawing/2016/5/10/chartex" xmlns:cx5="http://schemas.microsoft.com/office/drawing/2016/5/11/chartex" xmlns:cx6="http://schemas.microsoft.com/office/drawing/2016/5/12/chartex" xmlns:cx7="http://schemas.microsoft.com/office/drawing/2016/5/13/chartex" xmlns:cx8="http://schemas.microsoft.com/office/drawing/2016/5/14/chartex" xmlns:mc="http://schemas.openxmlformats.org/markup-compatibility/2006" xmlns:aink="http://schemas.microsoft.com/office/drawing/2016/ink" xmlns:am3d="http://schemas.microsoft.com/office/drawing/2017/model3d" xmlns:o="urn:schemas-microsoft-com:office:office" xmlns:oel="http://schemas.microsoft.com/office/2019/extlst" xmlns:r="http://schemas.openxmlformats.org/officeDocument/2006/relationships" xmlns:m="http://schemas.openxmlformats.org/officeDocument/2006/math" xmlns:v="urn:schemas-microsoft-com:vml" xmlns:wp14="http://schemas.microsoft.com/office/word/2010/wordprocessingDrawing" xmlns:wp="http://schemas.openxmlformats.org/drawingml/2006/wordprocessingDrawing" xmlns:w10="urn:schemas-microsoft-com:office:word" xmlns:w="http://schemas.openxmlformats.org/wordprocessingml/2006/main" xmlns:w14="http://schemas.microsoft.com/office/word/2010/wordml" xmlns:w15="http://schemas.microsoft.com/office/word/2012/wordml" xmlns:w16cex="http://schemas.microsoft.com/office/word/2018/wordml/cex" xmlns:w16cid="http://schemas.microsoft.com/office/word/2016/wordml/cid" xmlns:w16="http://schemas.microsoft.com/office/word/2018/wordml" xmlns:w16du="http://schemas.microsoft.com/office/word/2023/wordml/word16du" xmlns:w16sdtdh="http://schemas.microsoft.com/office/word/2020/wordml/sdtdatahash" xmlns:w16sdtfl="http://schemas.microsoft.com/office/word/2024/wordml/sdtformatlock" xmlns:w16se="http://schemas.microsoft.com/office/word/2015/wordml/symex" xmlns:wpg="http://schemas.microsoft.com/office/word/2010/wordprocessingGroup" xmlns:wpi="http://schemas.microsoft.com/office/word/2010/wordprocessingInk" xmlns:wne="http://schemas.microsoft.com/office/word/2006/wordml" xmlns:wps="http://schemas.microsoft.com/office/word/2010/wordprocessingShape" mc:Ignorable="w14 w15 w16se w16cid w16 w16cex w16sdtdh w16sdtfl w16du wp14">
+<w:document xmlns:wpc="http://schemas.microsoft.com/office/word/2010/wordprocessingCanvas" xmlns:mc="http://schemas.openxmlformats.org/markup-compatibility/2006" xmlns:o="urn:schemas-microsoft-com:office:office" xmlns:r="http://schemas.openxmlformats.org/officeDocument/2006/relationships" xmlns:m="http://schemas.openxmlformats.org/officeDocument/2006/math" xmlns:v="urn:schemas-microsoft-com:vml" xmlns:wp14="http://schemas.microsoft.com/office/word/2010/wordprocessingDrawing" xmlns:wp="http://schemas.openxmlformats.org/drawingml/2006/wordprocessingDrawing" xmlns:w10="urn:schemas-microsoft-com:office:word" xmlns:w="http://schemas.openxmlformats.org/wordprocessingml/2006/main" xmlns:w14="http://schemas.microsoft.com/office/word/2010/wordml" xmlns:w15="http://schemas.microsoft.com/office/word/2012/wordml" xmlns:wpg="http://schemas.microsoft.com/office/word/2010/wordprocessingGroup" xmlns:wpi="http://schemas.microsoft.com/office/word/2010/wordprocessingInk" xmlns:wne="http://schemas.microsoft.com/office/word/2006/wordml" xmlns:wps="http://schemas.microsoft.com/office/word/2010/wordprocessingShape" mc:Ignorable="w14 w15 wp14">
   <w:body>
     <w:p>
       <w:pPr>
@@ -784,7 +784,7 @@
                     <pic:cNvPicPr/>
                   </pic:nvPicPr>
                   <pic:blipFill>
-                    <a:blip r:embed="rId5" cstate="print"/>
+                    <a:blip r:embed="rId6" cstate="print"/>
                     <a:stretch>
                       <a:fillRect/>
                     </a:stretch>
@@ -1177,7 +1177,7 @@
                     <pic:cNvPicPr/>
                   </pic:nvPicPr>
                   <pic:blipFill>
-                    <a:blip r:embed="rId5" cstate="print"/>
+                    <a:blip r:embed="rId6" cstate="print"/>
                     <a:stretch>
                       <a:fillRect/>
                     </a:stretch>
@@ -1552,7 +1552,7 @@
                     <pic:cNvPicPr/>
                   </pic:nvPicPr>
                   <pic:blipFill>
-                    <a:blip r:embed="rId5" cstate="print"/>
+                    <a:blip r:embed="rId6" cstate="print"/>
                     <a:stretch>
                       <a:fillRect/>
                     </a:stretch>
@@ -1742,32 +1742,24 @@
         </w:rPr>
         <w:t xml:space="preserve"> </w:t>
       </w:r>
+      <w:r>
+        <w:rPr>
+          <w:rFonts w:asciiTheme="minorBidi" w:hAnsiTheme="minorBidi" w:cstheme="minorBidi"/>
+          <w:spacing w:val="-2"/>
+        </w:rPr>
+        <w:t>(</w:t>
+      </w:r>
+      <w:proofErr w:type="spellStart"/>
       <w:proofErr w:type="gramStart"/>
       <w:r>
         <w:rPr>
           <w:rFonts w:asciiTheme="minorBidi" w:hAnsiTheme="minorBidi" w:cstheme="minorBidi"/>
-          <w:spacing w:val="-2"/>
-        </w:rPr>
-        <w:t>(</w:t>
-      </w:r>
-      <w:r>
-        <w:rPr>
-          <w:rFonts w:asciiTheme="minorBidi" w:hAnsiTheme="minorBidi" w:cstheme="minorBidi"/>
-          <w:spacing w:val="-4"/>
-        </w:rPr>
-        <w:t xml:space="preserve"> </w:t>
-      </w:r>
-      <w:proofErr w:type="spellStart"/>
-      <w:r>
-        <w:rPr>
-          <w:rFonts w:asciiTheme="minorBidi" w:hAnsiTheme="minorBidi" w:cstheme="minorBidi"/>
           <w:color w:val="942658"/>
           <w:spacing w:val="-2"/>
         </w:rPr>
         <w:t>ConstructFlowDB</w:t>
       </w:r>
       <w:proofErr w:type="spellEnd"/>
-      <w:proofErr w:type="gramEnd"/>
       <w:r>
         <w:rPr>
           <w:rFonts w:asciiTheme="minorBidi" w:hAnsiTheme="minorBidi" w:cstheme="minorBidi"/>
@@ -1783,6 +1775,7 @@
         </w:rPr>
         <w:t>)</w:t>
       </w:r>
+      <w:proofErr w:type="gramEnd"/>
     </w:p>
     <w:p>
       <w:pPr>
@@ -1793,12 +1786,14 @@
           <w:rFonts w:asciiTheme="minorBidi" w:hAnsiTheme="minorBidi" w:cstheme="minorBidi"/>
         </w:rPr>
       </w:pPr>
+      <w:proofErr w:type="gramStart"/>
       <w:r>
         <w:rPr>
           <w:rFonts w:asciiTheme="minorBidi" w:hAnsiTheme="minorBidi" w:cstheme="minorBidi"/>
         </w:rPr>
         <w:t>using</w:t>
       </w:r>
+      <w:proofErr w:type="gramEnd"/>
       <w:r>
         <w:rPr>
           <w:rFonts w:asciiTheme="minorBidi" w:hAnsiTheme="minorBidi" w:cstheme="minorBidi"/>
@@ -1810,29 +1805,7 @@
         <w:rPr>
           <w:rFonts w:asciiTheme="minorBidi" w:hAnsiTheme="minorBidi" w:cstheme="minorBidi"/>
         </w:rPr>
-        <w:t>the</w:t>
-      </w:r>
-      <w:r>
-        <w:rPr>
-          <w:rFonts w:asciiTheme="minorBidi" w:hAnsiTheme="minorBidi" w:cstheme="minorBidi"/>
-          <w:spacing w:val="32"/>
-        </w:rPr>
-        <w:t xml:space="preserve"> </w:t>
-      </w:r>
-      <w:r>
-        <w:rPr>
-          <w:rFonts w:asciiTheme="minorBidi" w:hAnsiTheme="minorBidi" w:cstheme="minorBidi"/>
-          <w:color w:val="942658"/>
-        </w:rPr>
-        <w:t>sha</w:t>
-      </w:r>
-      <w:r>
-        <w:rPr>
-          <w:rFonts w:asciiTheme="minorBidi" w:hAnsiTheme="minorBidi" w:cstheme="minorBidi"/>
-          <w:color w:val="942658"/>
-          <w:spacing w:val="-36"/>
-        </w:rPr>
-        <w:t xml:space="preserve"> </w:t>
+        <w:t xml:space="preserve">a </w:t>
       </w:r>
       <w:r>
         <w:rPr>
@@ -2890,7 +2863,7 @@
                     </pic:cNvPicPr>
                   </pic:nvPicPr>
                   <pic:blipFill>
-                    <a:blip r:embed="rId6">
+                    <a:blip r:embed="rId7">
                       <a:extLst>
                         <a:ext uri="{28A0092B-C50C-407E-A947-70E740481C1C}">
                           <a14:useLocalDpi xmlns:a14="http://schemas.microsoft.com/office/drawing/2010/main" val="0"/>
@@ -3090,6 +3063,8 @@
       <w:r>
         <w:rPr>
           <w:rFonts w:asciiTheme="minorBidi" w:hAnsiTheme="minorBidi" w:cstheme="minorBidi"/>
+          <w:b w:val="0"/>
+          <w:bCs w:val="0"/>
           <w:spacing w:val="-2"/>
           <w:sz w:val="24"/>
           <w:szCs w:val="24"/>
@@ -3099,6 +3074,8 @@
       <w:r>
         <w:rPr>
           <w:rFonts w:asciiTheme="minorBidi" w:hAnsiTheme="minorBidi" w:cstheme="minorBidi"/>
+          <w:b w:val="0"/>
+          <w:bCs w:val="0"/>
           <w:spacing w:val="-24"/>
           <w:sz w:val="24"/>
           <w:szCs w:val="24"/>
@@ -3108,6 +3085,8 @@
       <w:r>
         <w:rPr>
           <w:rFonts w:asciiTheme="minorBidi" w:hAnsiTheme="minorBidi" w:cstheme="minorBidi"/>
+          <w:b w:val="0"/>
+          <w:bCs w:val="0"/>
           <w:spacing w:val="-2"/>
           <w:sz w:val="24"/>
           <w:szCs w:val="24"/>
@@ -3117,6 +3096,8 @@
       <w:r>
         <w:rPr>
           <w:rFonts w:asciiTheme="minorBidi" w:hAnsiTheme="minorBidi" w:cstheme="minorBidi"/>
+          <w:b w:val="0"/>
+          <w:bCs w:val="0"/>
           <w:spacing w:val="-24"/>
           <w:sz w:val="24"/>
           <w:szCs w:val="24"/>
@@ -3126,6 +3107,8 @@
       <w:r>
         <w:rPr>
           <w:rFonts w:asciiTheme="minorBidi" w:hAnsiTheme="minorBidi" w:cstheme="minorBidi"/>
+          <w:b w:val="0"/>
+          <w:bCs w:val="0"/>
           <w:spacing w:val="-2"/>
           <w:sz w:val="24"/>
           <w:szCs w:val="24"/>
@@ -3135,6 +3118,8 @@
       <w:r>
         <w:rPr>
           <w:rFonts w:asciiTheme="minorBidi" w:hAnsiTheme="minorBidi" w:cstheme="minorBidi"/>
+          <w:b w:val="0"/>
+          <w:bCs w:val="0"/>
           <w:spacing w:val="-24"/>
           <w:sz w:val="24"/>
           <w:szCs w:val="24"/>
@@ -3144,6 +3129,8 @@
       <w:r>
         <w:rPr>
           <w:rFonts w:asciiTheme="minorBidi" w:hAnsiTheme="minorBidi" w:cstheme="minorBidi"/>
+          <w:b w:val="0"/>
+          <w:bCs w:val="0"/>
           <w:spacing w:val="-2"/>
           <w:sz w:val="24"/>
           <w:szCs w:val="24"/>
@@ -3153,6 +3140,8 @@
       <w:r>
         <w:rPr>
           <w:rFonts w:asciiTheme="minorBidi" w:hAnsiTheme="minorBidi" w:cstheme="minorBidi"/>
+          <w:b w:val="0"/>
+          <w:bCs w:val="0"/>
           <w:spacing w:val="-24"/>
           <w:sz w:val="24"/>
           <w:szCs w:val="24"/>
@@ -3162,6 +3151,8 @@
       <w:r>
         <w:rPr>
           <w:rFonts w:asciiTheme="minorBidi" w:hAnsiTheme="minorBidi" w:cstheme="minorBidi"/>
+          <w:b w:val="0"/>
+          <w:bCs w:val="0"/>
           <w:spacing w:val="-2"/>
           <w:sz w:val="24"/>
           <w:szCs w:val="24"/>
@@ -3171,6 +3162,8 @@
       <w:r>
         <w:rPr>
           <w:rFonts w:asciiTheme="minorBidi" w:hAnsiTheme="minorBidi" w:cstheme="minorBidi"/>
+          <w:b w:val="0"/>
+          <w:bCs w:val="0"/>
           <w:spacing w:val="-24"/>
           <w:sz w:val="24"/>
           <w:szCs w:val="24"/>
@@ -3180,6 +3173,8 @@
       <w:r>
         <w:rPr>
           <w:rFonts w:asciiTheme="minorBidi" w:hAnsiTheme="minorBidi" w:cstheme="minorBidi"/>
+          <w:b w:val="0"/>
+          <w:bCs w:val="0"/>
           <w:spacing w:val="-2"/>
           <w:sz w:val="24"/>
           <w:szCs w:val="24"/>
@@ -3189,6 +3184,8 @@
       <w:r>
         <w:rPr>
           <w:rFonts w:asciiTheme="minorBidi" w:hAnsiTheme="minorBidi" w:cstheme="minorBidi"/>
+          <w:b w:val="0"/>
+          <w:bCs w:val="0"/>
           <w:spacing w:val="-24"/>
           <w:sz w:val="24"/>
           <w:szCs w:val="24"/>
@@ -3198,6 +3195,8 @@
       <w:r>
         <w:rPr>
           <w:rFonts w:asciiTheme="minorBidi" w:hAnsiTheme="minorBidi" w:cstheme="minorBidi"/>
+          <w:b w:val="0"/>
+          <w:bCs w:val="0"/>
           <w:spacing w:val="-2"/>
           <w:sz w:val="24"/>
           <w:szCs w:val="24"/>
@@ -3207,6 +3206,8 @@
       <w:r>
         <w:rPr>
           <w:rFonts w:asciiTheme="minorBidi" w:hAnsiTheme="minorBidi" w:cstheme="minorBidi"/>
+          <w:b w:val="0"/>
+          <w:bCs w:val="0"/>
           <w:spacing w:val="-24"/>
           <w:sz w:val="24"/>
           <w:szCs w:val="24"/>
@@ -3216,15 +3217,30 @@
       <w:r>
         <w:rPr>
           <w:rFonts w:asciiTheme="minorBidi" w:hAnsiTheme="minorBidi" w:cstheme="minorBidi"/>
+          <w:b w:val="0"/>
+          <w:bCs w:val="0"/>
           <w:spacing w:val="-2"/>
           <w:sz w:val="24"/>
           <w:szCs w:val="24"/>
         </w:rPr>
-        <w:t>(e.g.,</w:t>
-      </w:r>
-      <w:r>
-        <w:rPr>
-          <w:rFonts w:asciiTheme="minorBidi" w:hAnsiTheme="minorBidi" w:cstheme="minorBidi"/>
+        <w:t>(</w:t>
+      </w:r>
+      <w:r>
+        <w:rPr>
+          <w:rFonts w:asciiTheme="minorBidi" w:hAnsiTheme="minorBidi" w:cstheme="minorBidi"/>
+          <w:b w:val="0"/>
+          <w:bCs w:val="0"/>
+          <w:spacing w:val="-2"/>
+          <w:sz w:val="24"/>
+          <w:szCs w:val="24"/>
+        </w:rPr>
+        <w:t>like</w:t>
+      </w:r>
+      <w:r>
+        <w:rPr>
+          <w:rFonts w:asciiTheme="minorBidi" w:hAnsiTheme="minorBidi" w:cstheme="minorBidi"/>
+          <w:b w:val="0"/>
+          <w:bCs w:val="0"/>
           <w:spacing w:val="-24"/>
           <w:sz w:val="24"/>
           <w:szCs w:val="24"/>
@@ -3234,6 +3250,8 @@
       <w:r>
         <w:rPr>
           <w:rFonts w:asciiTheme="minorBidi" w:hAnsiTheme="minorBidi" w:cstheme="minorBidi"/>
+          <w:b w:val="0"/>
+          <w:bCs w:val="0"/>
           <w:spacing w:val="-2"/>
           <w:sz w:val="24"/>
           <w:szCs w:val="24"/>
@@ -3243,6 +3261,8 @@
       <w:r>
         <w:rPr>
           <w:rFonts w:asciiTheme="minorBidi" w:hAnsiTheme="minorBidi" w:cstheme="minorBidi"/>
+          <w:b w:val="0"/>
+          <w:bCs w:val="0"/>
           <w:spacing w:val="-24"/>
           <w:sz w:val="24"/>
           <w:szCs w:val="24"/>
@@ -3252,6 +3272,8 @@
       <w:r>
         <w:rPr>
           <w:rFonts w:asciiTheme="minorBidi" w:hAnsiTheme="minorBidi" w:cstheme="minorBidi"/>
+          <w:b w:val="0"/>
+          <w:bCs w:val="0"/>
           <w:spacing w:val="-2"/>
           <w:sz w:val="24"/>
           <w:szCs w:val="24"/>
@@ -3261,6 +3283,8 @@
       <w:r>
         <w:rPr>
           <w:rFonts w:asciiTheme="minorBidi" w:hAnsiTheme="minorBidi" w:cstheme="minorBidi"/>
+          <w:b w:val="0"/>
+          <w:bCs w:val="0"/>
           <w:spacing w:val="-24"/>
           <w:sz w:val="24"/>
           <w:szCs w:val="24"/>
@@ -3270,6 +3294,8 @@
       <w:r>
         <w:rPr>
           <w:rFonts w:asciiTheme="minorBidi" w:hAnsiTheme="minorBidi" w:cstheme="minorBidi"/>
+          <w:b w:val="0"/>
+          <w:bCs w:val="0"/>
           <w:spacing w:val="-2"/>
           <w:sz w:val="24"/>
           <w:szCs w:val="24"/>
@@ -3279,6 +3305,8 @@
       <w:r>
         <w:rPr>
           <w:rFonts w:asciiTheme="minorBidi" w:hAnsiTheme="minorBidi" w:cstheme="minorBidi"/>
+          <w:b w:val="0"/>
+          <w:bCs w:val="0"/>
           <w:spacing w:val="-24"/>
           <w:sz w:val="24"/>
           <w:szCs w:val="24"/>
@@ -3288,6 +3316,8 @@
       <w:r>
         <w:rPr>
           <w:rFonts w:asciiTheme="minorBidi" w:hAnsiTheme="minorBidi" w:cstheme="minorBidi"/>
+          <w:b w:val="0"/>
+          <w:bCs w:val="0"/>
           <w:spacing w:val="-2"/>
           <w:sz w:val="24"/>
           <w:szCs w:val="24"/>
@@ -3297,6 +3327,8 @@
       <w:r>
         <w:rPr>
           <w:rFonts w:asciiTheme="minorBidi" w:hAnsiTheme="minorBidi" w:cstheme="minorBidi"/>
+          <w:b w:val="0"/>
+          <w:bCs w:val="0"/>
           <w:spacing w:val="-24"/>
           <w:sz w:val="24"/>
           <w:szCs w:val="24"/>
@@ -3306,6 +3338,8 @@
       <w:r>
         <w:rPr>
           <w:rFonts w:asciiTheme="minorBidi" w:hAnsiTheme="minorBidi" w:cstheme="minorBidi"/>
+          <w:b w:val="0"/>
+          <w:bCs w:val="0"/>
           <w:spacing w:val="-2"/>
           <w:sz w:val="24"/>
           <w:szCs w:val="24"/>
@@ -3315,6 +3349,8 @@
       <w:r>
         <w:rPr>
           <w:rFonts w:asciiTheme="minorBidi" w:hAnsiTheme="minorBidi" w:cstheme="minorBidi"/>
+          <w:b w:val="0"/>
+          <w:bCs w:val="0"/>
           <w:spacing w:val="-24"/>
           <w:sz w:val="24"/>
           <w:szCs w:val="24"/>
@@ -3324,6 +3360,8 @@
       <w:r>
         <w:rPr>
           <w:rFonts w:asciiTheme="minorBidi" w:hAnsiTheme="minorBidi" w:cstheme="minorBidi"/>
+          <w:b w:val="0"/>
+          <w:bCs w:val="0"/>
           <w:spacing w:val="-2"/>
           <w:sz w:val="24"/>
           <w:szCs w:val="24"/>
@@ -3333,6 +3371,8 @@
       <w:r>
         <w:rPr>
           <w:rFonts w:asciiTheme="minorBidi" w:hAnsiTheme="minorBidi" w:cstheme="minorBidi"/>
+          <w:b w:val="0"/>
+          <w:bCs w:val="0"/>
           <w:sz w:val="24"/>
           <w:szCs w:val="24"/>
         </w:rPr>
@@ -3341,6 +3381,8 @@
       <w:r>
         <w:rPr>
           <w:rFonts w:asciiTheme="minorBidi" w:hAnsiTheme="minorBidi" w:cstheme="minorBidi"/>
+          <w:b w:val="0"/>
+          <w:bCs w:val="0"/>
           <w:spacing w:val="-8"/>
           <w:sz w:val="24"/>
           <w:szCs w:val="24"/>
@@ -3350,6 +3392,8 @@
       <w:r>
         <w:rPr>
           <w:rFonts w:asciiTheme="minorBidi" w:hAnsiTheme="minorBidi" w:cstheme="minorBidi"/>
+          <w:b w:val="0"/>
+          <w:bCs w:val="0"/>
           <w:sz w:val="24"/>
           <w:szCs w:val="24"/>
         </w:rPr>
@@ -3358,6 +3402,8 @@
       <w:r>
         <w:rPr>
           <w:rFonts w:asciiTheme="minorBidi" w:hAnsiTheme="minorBidi" w:cstheme="minorBidi"/>
+          <w:b w:val="0"/>
+          <w:bCs w:val="0"/>
           <w:spacing w:val="-8"/>
           <w:sz w:val="24"/>
           <w:szCs w:val="24"/>
@@ -3367,6 +3413,8 @@
       <w:r>
         <w:rPr>
           <w:rFonts w:asciiTheme="minorBidi" w:hAnsiTheme="minorBidi" w:cstheme="minorBidi"/>
+          <w:b w:val="0"/>
+          <w:bCs w:val="0"/>
           <w:sz w:val="24"/>
           <w:szCs w:val="24"/>
         </w:rPr>
@@ -3375,6 +3423,8 @@
       <w:r>
         <w:rPr>
           <w:rFonts w:asciiTheme="minorBidi" w:hAnsiTheme="minorBidi" w:cstheme="minorBidi"/>
+          <w:b w:val="0"/>
+          <w:bCs w:val="0"/>
           <w:spacing w:val="-8"/>
           <w:sz w:val="24"/>
           <w:szCs w:val="24"/>
@@ -3384,6 +3434,8 @@
       <w:r>
         <w:rPr>
           <w:rFonts w:asciiTheme="minorBidi" w:hAnsiTheme="minorBidi" w:cstheme="minorBidi"/>
+          <w:b w:val="0"/>
+          <w:bCs w:val="0"/>
           <w:sz w:val="24"/>
           <w:szCs w:val="24"/>
         </w:rPr>
@@ -3392,6 +3444,8 @@
       <w:r>
         <w:rPr>
           <w:rFonts w:asciiTheme="minorBidi" w:hAnsiTheme="minorBidi" w:cstheme="minorBidi"/>
+          <w:b w:val="0"/>
+          <w:bCs w:val="0"/>
           <w:spacing w:val="-8"/>
           <w:sz w:val="24"/>
           <w:szCs w:val="24"/>
@@ -3401,6 +3455,8 @@
       <w:r>
         <w:rPr>
           <w:rFonts w:asciiTheme="minorBidi" w:hAnsiTheme="minorBidi" w:cstheme="minorBidi"/>
+          <w:b w:val="0"/>
+          <w:bCs w:val="0"/>
           <w:sz w:val="24"/>
           <w:szCs w:val="24"/>
         </w:rPr>
@@ -3409,6 +3465,8 @@
       <w:r>
         <w:rPr>
           <w:rFonts w:asciiTheme="minorBidi" w:hAnsiTheme="minorBidi" w:cstheme="minorBidi"/>
+          <w:b w:val="0"/>
+          <w:bCs w:val="0"/>
           <w:spacing w:val="-8"/>
           <w:sz w:val="24"/>
           <w:szCs w:val="24"/>
@@ -3418,6 +3476,8 @@
       <w:r>
         <w:rPr>
           <w:rFonts w:asciiTheme="minorBidi" w:hAnsiTheme="minorBidi" w:cstheme="minorBidi"/>
+          <w:b w:val="0"/>
+          <w:bCs w:val="0"/>
           <w:sz w:val="24"/>
           <w:szCs w:val="24"/>
         </w:rPr>
@@ -3426,6 +3486,8 @@
       <w:r>
         <w:rPr>
           <w:rFonts w:asciiTheme="minorBidi" w:hAnsiTheme="minorBidi" w:cstheme="minorBidi"/>
+          <w:b w:val="0"/>
+          <w:bCs w:val="0"/>
           <w:spacing w:val="-8"/>
           <w:sz w:val="24"/>
           <w:szCs w:val="24"/>
@@ -3435,6 +3497,8 @@
       <w:r>
         <w:rPr>
           <w:rFonts w:asciiTheme="minorBidi" w:hAnsiTheme="minorBidi" w:cstheme="minorBidi"/>
+          <w:b w:val="0"/>
+          <w:bCs w:val="0"/>
           <w:sz w:val="24"/>
           <w:szCs w:val="24"/>
         </w:rPr>
@@ -3443,6 +3507,8 @@
       <w:r>
         <w:rPr>
           <w:rFonts w:asciiTheme="minorBidi" w:hAnsiTheme="minorBidi" w:cstheme="minorBidi"/>
+          <w:b w:val="0"/>
+          <w:bCs w:val="0"/>
           <w:spacing w:val="-8"/>
           <w:sz w:val="24"/>
           <w:szCs w:val="24"/>
@@ -3452,6 +3518,8 @@
       <w:r>
         <w:rPr>
           <w:rFonts w:asciiTheme="minorBidi" w:hAnsiTheme="minorBidi" w:cstheme="minorBidi"/>
+          <w:b w:val="0"/>
+          <w:bCs w:val="0"/>
           <w:sz w:val="24"/>
           <w:szCs w:val="24"/>
         </w:rPr>
@@ -3460,6 +3528,8 @@
       <w:r>
         <w:rPr>
           <w:rFonts w:asciiTheme="minorBidi" w:hAnsiTheme="minorBidi" w:cstheme="minorBidi"/>
+          <w:b w:val="0"/>
+          <w:bCs w:val="0"/>
           <w:spacing w:val="-8"/>
           <w:sz w:val="24"/>
           <w:szCs w:val="24"/>
@@ -3469,6 +3539,8 @@
       <w:r>
         <w:rPr>
           <w:rFonts w:asciiTheme="minorBidi" w:hAnsiTheme="minorBidi" w:cstheme="minorBidi"/>
+          <w:b w:val="0"/>
+          <w:bCs w:val="0"/>
           <w:sz w:val="24"/>
           <w:szCs w:val="24"/>
         </w:rPr>
@@ -3477,6 +3549,8 @@
       <w:r>
         <w:rPr>
           <w:rFonts w:asciiTheme="minorBidi" w:hAnsiTheme="minorBidi" w:cstheme="minorBidi"/>
+          <w:b w:val="0"/>
+          <w:bCs w:val="0"/>
           <w:spacing w:val="-8"/>
           <w:sz w:val="24"/>
           <w:szCs w:val="24"/>
@@ -3486,6 +3560,8 @@
       <w:r>
         <w:rPr>
           <w:rFonts w:asciiTheme="minorBidi" w:hAnsiTheme="minorBidi" w:cstheme="minorBidi"/>
+          <w:b w:val="0"/>
+          <w:bCs w:val="0"/>
           <w:sz w:val="24"/>
           <w:szCs w:val="24"/>
         </w:rPr>
@@ -3494,6 +3570,8 @@
       <w:r>
         <w:rPr>
           <w:rFonts w:asciiTheme="minorBidi" w:hAnsiTheme="minorBidi" w:cstheme="minorBidi"/>
+          <w:b w:val="0"/>
+          <w:bCs w:val="0"/>
           <w:spacing w:val="-8"/>
           <w:sz w:val="24"/>
           <w:szCs w:val="24"/>
@@ -3503,6 +3581,8 @@
       <w:r>
         <w:rPr>
           <w:rFonts w:asciiTheme="minorBidi" w:hAnsiTheme="minorBidi" w:cstheme="minorBidi"/>
+          <w:b w:val="0"/>
+          <w:bCs w:val="0"/>
           <w:sz w:val="24"/>
           <w:szCs w:val="24"/>
         </w:rPr>
@@ -3511,6 +3591,8 @@
       <w:r>
         <w:rPr>
           <w:rFonts w:asciiTheme="minorBidi" w:hAnsiTheme="minorBidi" w:cstheme="minorBidi"/>
+          <w:b w:val="0"/>
+          <w:bCs w:val="0"/>
           <w:spacing w:val="-8"/>
           <w:sz w:val="24"/>
           <w:szCs w:val="24"/>
@@ -3520,6 +3602,8 @@
       <w:r>
         <w:rPr>
           <w:rFonts w:asciiTheme="minorBidi" w:hAnsiTheme="minorBidi" w:cstheme="minorBidi"/>
+          <w:b w:val="0"/>
+          <w:bCs w:val="0"/>
           <w:sz w:val="24"/>
           <w:szCs w:val="24"/>
         </w:rPr>
@@ -3528,6 +3612,8 @@
       <w:r>
         <w:rPr>
           <w:rFonts w:asciiTheme="minorBidi" w:hAnsiTheme="minorBidi" w:cstheme="minorBidi"/>
+          <w:b w:val="0"/>
+          <w:bCs w:val="0"/>
           <w:spacing w:val="-8"/>
           <w:sz w:val="24"/>
           <w:szCs w:val="24"/>
@@ -3537,6 +3623,8 @@
       <w:r>
         <w:rPr>
           <w:rFonts w:asciiTheme="minorBidi" w:hAnsiTheme="minorBidi" w:cstheme="minorBidi"/>
+          <w:b w:val="0"/>
+          <w:bCs w:val="0"/>
           <w:sz w:val="24"/>
           <w:szCs w:val="24"/>
         </w:rPr>
@@ -3545,6 +3633,8 @@
       <w:r>
         <w:rPr>
           <w:rFonts w:asciiTheme="minorBidi" w:hAnsiTheme="minorBidi" w:cstheme="minorBidi"/>
+          <w:b w:val="0"/>
+          <w:bCs w:val="0"/>
           <w:spacing w:val="-8"/>
           <w:sz w:val="24"/>
           <w:szCs w:val="24"/>
@@ -3554,6 +3644,8 @@
       <w:r>
         <w:rPr>
           <w:rFonts w:asciiTheme="minorBidi" w:hAnsiTheme="minorBidi" w:cstheme="minorBidi"/>
+          <w:b w:val="0"/>
+          <w:bCs w:val="0"/>
           <w:sz w:val="24"/>
           <w:szCs w:val="24"/>
         </w:rPr>
@@ -3562,6 +3654,8 @@
       <w:r>
         <w:rPr>
           <w:rFonts w:asciiTheme="minorBidi" w:hAnsiTheme="minorBidi" w:cstheme="minorBidi"/>
+          <w:b w:val="0"/>
+          <w:bCs w:val="0"/>
           <w:spacing w:val="-8"/>
           <w:sz w:val="24"/>
           <w:szCs w:val="24"/>
@@ -3571,6 +3665,8 @@
       <w:r>
         <w:rPr>
           <w:rFonts w:asciiTheme="minorBidi" w:hAnsiTheme="minorBidi" w:cstheme="minorBidi"/>
+          <w:b w:val="0"/>
+          <w:bCs w:val="0"/>
           <w:sz w:val="24"/>
           <w:szCs w:val="24"/>
         </w:rPr>
@@ -3579,6 +3675,8 @@
       <w:r>
         <w:rPr>
           <w:rFonts w:asciiTheme="minorBidi" w:hAnsiTheme="minorBidi" w:cstheme="minorBidi"/>
+          <w:b w:val="0"/>
+          <w:bCs w:val="0"/>
           <w:spacing w:val="-2"/>
           <w:w w:val="105"/>
           <w:sz w:val="24"/>
@@ -3589,6 +3687,8 @@
       <w:r>
         <w:rPr>
           <w:rFonts w:asciiTheme="minorBidi" w:hAnsiTheme="minorBidi" w:cstheme="minorBidi"/>
+          <w:b w:val="0"/>
+          <w:bCs w:val="0"/>
           <w:spacing w:val="-23"/>
           <w:w w:val="105"/>
           <w:sz w:val="24"/>
@@ -3599,6 +3699,8 @@
       <w:r>
         <w:rPr>
           <w:rFonts w:asciiTheme="minorBidi" w:hAnsiTheme="minorBidi" w:cstheme="minorBidi"/>
+          <w:b w:val="0"/>
+          <w:bCs w:val="0"/>
           <w:spacing w:val="-2"/>
           <w:w w:val="105"/>
           <w:sz w:val="24"/>
@@ -3609,6 +3711,8 @@
       <w:r>
         <w:rPr>
           <w:rFonts w:asciiTheme="minorBidi" w:hAnsiTheme="minorBidi" w:cstheme="minorBidi"/>
+          <w:b w:val="0"/>
+          <w:bCs w:val="0"/>
           <w:spacing w:val="-23"/>
           <w:w w:val="105"/>
           <w:sz w:val="24"/>
@@ -3619,6 +3723,8 @@
       <w:r>
         <w:rPr>
           <w:rFonts w:asciiTheme="minorBidi" w:hAnsiTheme="minorBidi" w:cstheme="minorBidi"/>
+          <w:b w:val="0"/>
+          <w:bCs w:val="0"/>
           <w:spacing w:val="-2"/>
           <w:w w:val="105"/>
           <w:sz w:val="24"/>
@@ -3629,6 +3735,8 @@
       <w:r>
         <w:rPr>
           <w:rFonts w:asciiTheme="minorBidi" w:hAnsiTheme="minorBidi" w:cstheme="minorBidi"/>
+          <w:b w:val="0"/>
+          <w:bCs w:val="0"/>
           <w:spacing w:val="-23"/>
           <w:w w:val="105"/>
           <w:sz w:val="24"/>
@@ -3639,6 +3747,8 @@
       <w:r>
         <w:rPr>
           <w:rFonts w:asciiTheme="minorBidi" w:hAnsiTheme="minorBidi" w:cstheme="minorBidi"/>
+          <w:b w:val="0"/>
+          <w:bCs w:val="0"/>
           <w:spacing w:val="-2"/>
           <w:w w:val="105"/>
           <w:sz w:val="24"/>
@@ -3649,6 +3759,8 @@
       <w:r>
         <w:rPr>
           <w:rFonts w:asciiTheme="minorBidi" w:hAnsiTheme="minorBidi" w:cstheme="minorBidi"/>
+          <w:b w:val="0"/>
+          <w:bCs w:val="0"/>
           <w:spacing w:val="-23"/>
           <w:w w:val="105"/>
           <w:sz w:val="24"/>
@@ -3659,6 +3771,8 @@
       <w:r>
         <w:rPr>
           <w:rFonts w:asciiTheme="minorBidi" w:hAnsiTheme="minorBidi" w:cstheme="minorBidi"/>
+          <w:b w:val="0"/>
+          <w:bCs w:val="0"/>
           <w:spacing w:val="-2"/>
           <w:w w:val="105"/>
           <w:sz w:val="24"/>
@@ -3669,6 +3783,8 @@
       <w:r>
         <w:rPr>
           <w:rFonts w:asciiTheme="minorBidi" w:hAnsiTheme="minorBidi" w:cstheme="minorBidi"/>
+          <w:b w:val="0"/>
+          <w:bCs w:val="0"/>
           <w:spacing w:val="-23"/>
           <w:w w:val="105"/>
           <w:sz w:val="24"/>
@@ -3679,6 +3795,8 @@
       <w:r>
         <w:rPr>
           <w:rFonts w:asciiTheme="minorBidi" w:hAnsiTheme="minorBidi" w:cstheme="minorBidi"/>
+          <w:b w:val="0"/>
+          <w:bCs w:val="0"/>
           <w:spacing w:val="-2"/>
           <w:w w:val="105"/>
           <w:sz w:val="24"/>
@@ -3689,6 +3807,8 @@
       <w:r>
         <w:rPr>
           <w:rFonts w:asciiTheme="minorBidi" w:hAnsiTheme="minorBidi" w:cstheme="minorBidi"/>
+          <w:b w:val="0"/>
+          <w:bCs w:val="0"/>
           <w:spacing w:val="-23"/>
           <w:w w:val="105"/>
           <w:sz w:val="24"/>
@@ -3699,6 +3819,8 @@
       <w:r>
         <w:rPr>
           <w:rFonts w:asciiTheme="minorBidi" w:hAnsiTheme="minorBidi" w:cstheme="minorBidi"/>
+          <w:b w:val="0"/>
+          <w:bCs w:val="0"/>
           <w:spacing w:val="-2"/>
           <w:w w:val="105"/>
           <w:sz w:val="24"/>
@@ -3709,6 +3831,8 @@
       <w:r>
         <w:rPr>
           <w:rFonts w:asciiTheme="minorBidi" w:hAnsiTheme="minorBidi" w:cstheme="minorBidi"/>
+          <w:b w:val="0"/>
+          <w:bCs w:val="0"/>
           <w:spacing w:val="-23"/>
           <w:w w:val="105"/>
           <w:sz w:val="24"/>
@@ -3719,6 +3843,8 @@
       <w:r>
         <w:rPr>
           <w:rFonts w:asciiTheme="minorBidi" w:hAnsiTheme="minorBidi" w:cstheme="minorBidi"/>
+          <w:b w:val="0"/>
+          <w:bCs w:val="0"/>
           <w:spacing w:val="-2"/>
           <w:w w:val="105"/>
           <w:sz w:val="24"/>
@@ -4128,7 +4254,7 @@
                     </pic:cNvPicPr>
                   </pic:nvPicPr>
                   <pic:blipFill>
-                    <a:blip r:embed="rId7">
+                    <a:blip r:embed="rId8">
                       <a:extLst>
                         <a:ext uri="{28A0092B-C50C-407E-A947-70E740481C1C}">
                           <a14:useLocalDpi xmlns:a14="http://schemas.microsoft.com/office/drawing/2010/main" val="0"/>
@@ -4362,7 +4488,7 @@
               </wp:anchor>
             </w:drawing>
           </mc:Choice>
-          <mc:Fallback>
+          <mc:Fallback xmlns:w16se="http://schemas.microsoft.com/office/word/2015/wordml/symex" xmlns:w16sdtfl="http://schemas.microsoft.com/office/word/2024/wordml/sdtformatlock" xmlns:w16sdtdh="http://schemas.microsoft.com/office/word/2020/wordml/sdtdatahash" xmlns:w16du="http://schemas.microsoft.com/office/word/2023/wordml/word16du" xmlns:w16="http://schemas.microsoft.com/office/word/2018/wordml" xmlns:w16cid="http://schemas.microsoft.com/office/word/2016/wordml/cid" xmlns:w16cex="http://schemas.microsoft.com/office/word/2018/wordml/cex" xmlns:oel="http://schemas.microsoft.com/office/2019/extlst" xmlns:am3d="http://schemas.microsoft.com/office/drawing/2017/model3d" xmlns:aink="http://schemas.microsoft.com/office/drawing/2016/ink" xmlns:cx8="http://schemas.microsoft.com/office/drawing/2016/5/14/chartex" xmlns:cx7="http://schemas.microsoft.com/office/drawing/2016/5/13/chartex" xmlns:cx6="http://schemas.microsoft.com/office/drawing/2016/5/12/chartex" xmlns:cx5="http://schemas.microsoft.com/office/drawing/2016/5/11/chartex" xmlns:cx4="http://schemas.microsoft.com/office/drawing/2016/5/10/chartex" xmlns:cx3="http://schemas.microsoft.com/office/drawing/2016/5/9/chartex" xmlns:cx2="http://schemas.microsoft.com/office/drawing/2015/10/21/chartex" xmlns:cx1="http://schemas.microsoft.com/office/drawing/2015/9/8/chartex" xmlns:cx="http://schemas.microsoft.com/office/drawing/2014/chartex">
             <w:pict>
               <v:group w14:anchorId="62526F51" id="Group 8" o:spid="_x0000_s1026" style="position:absolute;margin-left:30pt;margin-top:14pt;width:535pt;height:1.55pt;z-index:-251660800;mso-wrap-distance-left:0;mso-wrap-distance-right:0;mso-position-horizontal-relative:page" coordsize="67945,196" o:gfxdata="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">
                 <v:shape id="Graphic 9" o:spid="_x0000_s1027" style="position:absolute;width:67945;height:95;visibility:visible;mso-wrap-style:square;v-text-anchor:top" coordsize="6794500,9525" o:gfxdata="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" path="m6794330,9529l,9529,,,6794330,r,9529xe" fillcolor="#999" stroked="f">
@@ -4908,7 +5034,6 @@
         </w:rPr>
       </w:pPr>
       <w:proofErr w:type="spellStart"/>
-      <w:proofErr w:type="gramStart"/>
       <w:r>
         <w:rPr>
           <w:rFonts w:asciiTheme="minorBidi" w:hAnsiTheme="minorBidi" w:cstheme="minorBidi"/>
@@ -4917,7 +5042,6 @@
         <w:t>AdministrationController</w:t>
       </w:r>
       <w:proofErr w:type="spellEnd"/>
-      <w:proofErr w:type="gramEnd"/>
       <w:r>
         <w:rPr>
           <w:rFonts w:asciiTheme="minorBidi" w:hAnsiTheme="minorBidi" w:cstheme="minorBidi"/>
@@ -5466,14 +5590,12 @@
         </w:rPr>
         <w:t xml:space="preserve"> </w:t>
       </w:r>
-      <w:proofErr w:type="gramStart"/>
       <w:r>
         <w:rPr>
           <w:rFonts w:asciiTheme="minorBidi" w:hAnsiTheme="minorBidi" w:cstheme="minorBidi"/>
         </w:rPr>
         <w:t>handle</w:t>
       </w:r>
-      <w:proofErr w:type="gramEnd"/>
       <w:r>
         <w:rPr>
           <w:rFonts w:asciiTheme="minorBidi" w:hAnsiTheme="minorBidi" w:cstheme="minorBidi"/>
@@ -5791,7 +5913,7 @@
                     </pic:cNvPicPr>
                   </pic:nvPicPr>
                   <pic:blipFill>
-                    <a:blip r:embed="rId8">
+                    <a:blip r:embed="rId9">
                       <a:extLst>
                         <a:ext uri="{28A0092B-C50C-407E-A947-70E740481C1C}">
                           <a14:useLocalDpi xmlns:a14="http://schemas.microsoft.com/office/drawing/2010/main" val="0"/>
@@ -6034,7 +6156,7 @@
               </wp:anchor>
             </w:drawing>
           </mc:Choice>
-          <mc:Fallback>
+          <mc:Fallback xmlns:w16se="http://schemas.microsoft.com/office/word/2015/wordml/symex" xmlns:w16sdtfl="http://schemas.microsoft.com/office/word/2024/wordml/sdtformatlock" xmlns:w16sdtdh="http://schemas.microsoft.com/office/word/2020/wordml/sdtdatahash" xmlns:w16du="http://schemas.microsoft.com/office/word/2023/wordml/word16du" xmlns:w16="http://schemas.microsoft.com/office/word/2018/wordml" xmlns:w16cid="http://schemas.microsoft.com/office/word/2016/wordml/cid" xmlns:w16cex="http://schemas.microsoft.com/office/word/2018/wordml/cex" xmlns:oel="http://schemas.microsoft.com/office/2019/extlst" xmlns:am3d="http://schemas.microsoft.com/office/drawing/2017/model3d" xmlns:aink="http://schemas.microsoft.com/office/drawing/2016/ink" xmlns:cx8="http://schemas.microsoft.com/office/drawing/2016/5/14/chartex" xmlns:cx7="http://schemas.microsoft.com/office/drawing/2016/5/13/chartex" xmlns:cx6="http://schemas.microsoft.com/office/drawing/2016/5/12/chartex" xmlns:cx5="http://schemas.microsoft.com/office/drawing/2016/5/11/chartex" xmlns:cx4="http://schemas.microsoft.com/office/drawing/2016/5/10/chartex" xmlns:cx3="http://schemas.microsoft.com/office/drawing/2016/5/9/chartex" xmlns:cx2="http://schemas.microsoft.com/office/drawing/2015/10/21/chartex" xmlns:cx1="http://schemas.microsoft.com/office/drawing/2015/9/8/chartex" xmlns:cx="http://schemas.microsoft.com/office/drawing/2014/chartex">
             <w:pict>
               <v:group w14:anchorId="37DCD2DC" id="Group 12" o:spid="_x0000_s1026" style="position:absolute;margin-left:30pt;margin-top:14.05pt;width:535pt;height:1.55pt;z-index:-251658752;mso-wrap-distance-left:0;mso-wrap-distance-right:0;mso-position-horizontal-relative:page" coordsize="67945,196" o:gfxdata="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">
                 <v:shape id="Graphic 13" o:spid="_x0000_s1027" style="position:absolute;width:67945;height:95;visibility:visible;mso-wrap-style:square;v-text-anchor:top" coordsize="6794500,9525" o:gfxdata="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" path="m6794330,9529l,9529,,,6794330,r,9529xe" fillcolor="#999" stroked="f">
@@ -6692,29 +6814,14 @@
         <w:rPr>
           <w:rFonts w:asciiTheme="minorBidi" w:hAnsiTheme="minorBidi" w:cstheme="minorBidi"/>
         </w:rPr>
-        <w:t xml:space="preserve">logic </w:t>
-      </w:r>
-      <w:proofErr w:type="gramStart"/>
-      <w:r>
-        <w:rPr>
-          <w:rFonts w:asciiTheme="minorBidi" w:hAnsiTheme="minorBidi" w:cstheme="minorBidi"/>
-        </w:rPr>
-        <w:t xml:space="preserve">( </w:t>
+        <w:t>logic (</w:t>
       </w:r>
       <w:r>
         <w:rPr>
           <w:rFonts w:asciiTheme="minorBidi" w:hAnsiTheme="minorBidi" w:cstheme="minorBidi"/>
           <w:color w:val="942658"/>
         </w:rPr>
-        <w:t>if</w:t>
-      </w:r>
-      <w:proofErr w:type="gramEnd"/>
-      <w:r>
-        <w:rPr>
-          <w:rFonts w:asciiTheme="minorBidi" w:hAnsiTheme="minorBidi" w:cstheme="minorBidi"/>
-          <w:color w:val="942658"/>
-        </w:rPr>
-        <w:t xml:space="preserve">-else </w:t>
+        <w:t xml:space="preserve">if-else </w:t>
       </w:r>
       <w:r>
         <w:rPr>
@@ -6962,7 +7069,6 @@
         <w:t xml:space="preserve"> </w:t>
       </w:r>
       <w:proofErr w:type="spellStart"/>
-      <w:proofErr w:type="gramStart"/>
       <w:r>
         <w:rPr>
           <w:rFonts w:asciiTheme="minorBidi" w:hAnsiTheme="minorBidi" w:cstheme="minorBidi"/>
@@ -6985,7 +7091,6 @@
         </w:rPr>
         <w:t>)</w:t>
       </w:r>
-      <w:proofErr w:type="gramEnd"/>
       <w:r>
         <w:rPr>
           <w:rFonts w:asciiTheme="minorBidi" w:hAnsiTheme="minorBidi" w:cstheme="minorBidi"/>
@@ -7045,7 +7150,6 @@
         </w:rPr>
         <w:t xml:space="preserve"> </w:t>
       </w:r>
-      <w:proofErr w:type="gramStart"/>
       <w:r>
         <w:rPr>
           <w:rFonts w:asciiTheme="minorBidi" w:hAnsiTheme="minorBidi" w:cstheme="minorBidi"/>
@@ -7068,7 +7172,6 @@
         <w:t>EmailReminder</w:t>
       </w:r>
       <w:proofErr w:type="spellEnd"/>
-      <w:proofErr w:type="gramEnd"/>
       <w:r>
         <w:rPr>
           <w:rFonts w:asciiTheme="minorBidi" w:hAnsiTheme="minorBidi" w:cstheme="minorBidi"/>
@@ -7151,7 +7254,6 @@
         <w:t xml:space="preserve"> </w:t>
       </w:r>
       <w:proofErr w:type="spellStart"/>
-      <w:proofErr w:type="gramStart"/>
       <w:r>
         <w:rPr>
           <w:rFonts w:asciiTheme="minorBidi" w:hAnsiTheme="minorBidi" w:cstheme="minorBidi"/>
@@ -7172,14 +7274,7 @@
         <w:rPr>
           <w:rFonts w:asciiTheme="minorBidi" w:hAnsiTheme="minorBidi" w:cstheme="minorBidi"/>
         </w:rPr>
-        <w:t>)</w:t>
-      </w:r>
-      <w:proofErr w:type="gramEnd"/>
-      <w:r>
-        <w:rPr>
-          <w:rFonts w:asciiTheme="minorBidi" w:hAnsiTheme="minorBidi" w:cstheme="minorBidi"/>
-        </w:rPr>
-        <w:t>.</w:t>
+        <w:t>).</w:t>
       </w:r>
     </w:p>
     <w:p>
@@ -7490,7 +7585,7 @@
                     </pic:cNvPicPr>
                   </pic:nvPicPr>
                   <pic:blipFill>
-                    <a:blip r:embed="rId9">
+                    <a:blip r:embed="rId10">
                       <a:extLst>
                         <a:ext uri="{28A0092B-C50C-407E-A947-70E740481C1C}">
                           <a14:useLocalDpi xmlns:a14="http://schemas.microsoft.com/office/drawing/2010/main" val="0"/>
@@ -7737,6 +7832,7 @@
         </w:rPr>
         <w:t xml:space="preserve"> </w:t>
       </w:r>
+      <w:proofErr w:type="gramStart"/>
       <w:r>
         <w:rPr>
           <w:rFonts w:asciiTheme="minorBidi" w:hAnsiTheme="minorBidi" w:cstheme="minorBidi"/>
@@ -7761,6 +7857,7 @@
         <w:t>WorkloadReport</w:t>
       </w:r>
       <w:proofErr w:type="spellEnd"/>
+      <w:proofErr w:type="gramEnd"/>
       <w:r>
         <w:rPr>
           <w:rFonts w:asciiTheme="minorBidi" w:hAnsiTheme="minorBidi" w:cstheme="minorBidi"/>
@@ -7784,7 +7881,6 @@
         <w:t xml:space="preserve"> </w:t>
       </w:r>
       <w:proofErr w:type="spellStart"/>
-      <w:proofErr w:type="gramStart"/>
       <w:r>
         <w:rPr>
           <w:rFonts w:asciiTheme="minorBidi" w:hAnsiTheme="minorBidi" w:cstheme="minorBidi"/>
@@ -7809,7 +7905,6 @@
         </w:rPr>
         <w:t>)</w:t>
       </w:r>
-      <w:proofErr w:type="gramEnd"/>
       <w:r>
         <w:rPr>
           <w:rFonts w:asciiTheme="minorBidi" w:hAnsiTheme="minorBidi" w:cstheme="minorBidi"/>
@@ -8183,7 +8278,6 @@
         <w:t xml:space="preserve"> </w:t>
       </w:r>
       <w:proofErr w:type="spellStart"/>
-      <w:proofErr w:type="gramStart"/>
       <w:r>
         <w:rPr>
           <w:rFonts w:asciiTheme="minorBidi" w:hAnsiTheme="minorBidi" w:cstheme="minorBidi"/>
@@ -8206,7 +8300,6 @@
         </w:rPr>
         <w:t>)</w:t>
       </w:r>
-      <w:proofErr w:type="gramEnd"/>
       <w:r>
         <w:rPr>
           <w:rFonts w:asciiTheme="minorBidi" w:hAnsiTheme="minorBidi" w:cstheme="minorBidi"/>
@@ -8552,7 +8645,7 @@
                     </pic:cNvPicPr>
                   </pic:nvPicPr>
                   <pic:blipFill>
-                    <a:blip r:embed="rId10">
+                    <a:blip r:embed="rId11">
                       <a:extLst>
                         <a:ext uri="{28A0092B-C50C-407E-A947-70E740481C1C}">
                           <a14:useLocalDpi xmlns:a14="http://schemas.microsoft.com/office/drawing/2010/main" val="0"/>
@@ -9499,6 +9592,147 @@
         <w:t>on the selected factory.</w:t>
       </w:r>
     </w:p>
+    <w:p>
+      <w:pPr>
+        <w:pStyle w:val="ListParagraph"/>
+        <w:tabs>
+          <w:tab w:val="left" w:pos="632"/>
+          <w:tab w:val="left" w:pos="634"/>
+        </w:tabs>
+        <w:spacing w:before="100" w:line="312" w:lineRule="auto"/>
+        <w:ind w:left="634" w:right="293" w:firstLine="0"/>
+        <w:rPr>
+          <w:rFonts w:asciiTheme="minorBidi" w:hAnsiTheme="minorBidi" w:cstheme="minorBidi"/>
+          <w:sz w:val="24"/>
+        </w:rPr>
+      </w:pPr>
+      <w:r>
+        <w:rPr>
+          <w:rFonts w:asciiTheme="minorBidi" w:hAnsiTheme="minorBidi" w:cstheme="minorBidi"/>
+          <w:sz w:val="24"/>
+        </w:rPr>
+        <w:drawing>
+          <wp:inline distT="0" distB="0" distL="0" distR="0" wp14:anchorId="30F555EE" wp14:editId="4DD7106E">
+            <wp:extent cx="5793740" cy="3618397"/>
+            <wp:effectExtent l="0" t="0" r="0" b="1270"/>
+            <wp:docPr id="4" name="Picture 4"/>
+            <wp:cNvGraphicFramePr>
+              <a:graphicFrameLocks xmlns:a="http://schemas.openxmlformats.org/drawingml/2006/main" noChangeAspect="1"/>
+            </wp:cNvGraphicFramePr>
+            <a:graphic xmlns:a="http://schemas.openxmlformats.org/drawingml/2006/main">
+              <a:graphicData uri="http://schemas.openxmlformats.org/drawingml/2006/picture">
+                <pic:pic xmlns:pic="http://schemas.openxmlformats.org/drawingml/2006/picture">
+                  <pic:nvPicPr>
+                    <pic:cNvPr id="1" name=""/>
+                    <pic:cNvPicPr/>
+                  </pic:nvPicPr>
+                  <pic:blipFill>
+                    <a:blip r:embed="rId12"/>
+                    <a:stretch>
+                      <a:fillRect/>
+                    </a:stretch>
+                  </pic:blipFill>
+                  <pic:spPr>
+                    <a:xfrm>
+                      <a:off x="0" y="0"/>
+                      <a:ext cx="5798856" cy="3621592"/>
+                    </a:xfrm>
+                    <a:prstGeom prst="rect">
+                      <a:avLst/>
+                    </a:prstGeom>
+                  </pic:spPr>
+                </pic:pic>
+              </a:graphicData>
+            </a:graphic>
+          </wp:inline>
+        </w:drawing>
+      </w:r>
+      <w:r>
+        <w:rPr>
+          <w:rFonts w:asciiTheme="minorBidi" w:hAnsiTheme="minorBidi" w:cstheme="minorBidi"/>
+          <w:sz w:val="24"/>
+        </w:rPr>
+        <w:drawing>
+          <wp:inline distT="0" distB="0" distL="0" distR="0" wp14:anchorId="240A1234" wp14:editId="4E76C23E">
+            <wp:extent cx="5801360" cy="982697"/>
+            <wp:effectExtent l="0" t="0" r="0" b="8255"/>
+            <wp:docPr id="5" name="Picture 5"/>
+            <wp:cNvGraphicFramePr>
+              <a:graphicFrameLocks xmlns:a="http://schemas.openxmlformats.org/drawingml/2006/main" noChangeAspect="1"/>
+            </wp:cNvGraphicFramePr>
+            <a:graphic xmlns:a="http://schemas.openxmlformats.org/drawingml/2006/main">
+              <a:graphicData uri="http://schemas.openxmlformats.org/drawingml/2006/picture">
+                <pic:pic xmlns:pic="http://schemas.openxmlformats.org/drawingml/2006/picture">
+                  <pic:nvPicPr>
+                    <pic:cNvPr id="1" name=""/>
+                    <pic:cNvPicPr/>
+                  </pic:nvPicPr>
+                  <pic:blipFill>
+                    <a:blip r:embed="rId13"/>
+                    <a:stretch>
+                      <a:fillRect/>
+                    </a:stretch>
+                  </pic:blipFill>
+                  <pic:spPr>
+                    <a:xfrm>
+                      <a:off x="0" y="0"/>
+                      <a:ext cx="5867875" cy="993964"/>
+                    </a:xfrm>
+                    <a:prstGeom prst="rect">
+                      <a:avLst/>
+                    </a:prstGeom>
+                  </pic:spPr>
+                </pic:pic>
+              </a:graphicData>
+            </a:graphic>
+          </wp:inline>
+        </w:drawing>
+      </w:r>
+      <w:bookmarkStart w:id="0" w:name="_GoBack"/>
+      <w:r>
+        <w:rPr>
+          <w:rFonts w:asciiTheme="minorBidi" w:hAnsiTheme="minorBidi" w:cstheme="minorBidi"/>
+          <w:sz w:val="24"/>
+        </w:rPr>
+        <w:lastRenderedPageBreak/>
+        <w:drawing>
+          <wp:inline distT="0" distB="0" distL="0" distR="0" wp14:anchorId="2EA015EA" wp14:editId="7B1A5CDC">
+            <wp:extent cx="5818425" cy="5198110"/>
+            <wp:effectExtent l="0" t="0" r="0" b="2540"/>
+            <wp:docPr id="6" name="Picture 6"/>
+            <wp:cNvGraphicFramePr>
+              <a:graphicFrameLocks xmlns:a="http://schemas.openxmlformats.org/drawingml/2006/main" noChangeAspect="1"/>
+            </wp:cNvGraphicFramePr>
+            <a:graphic xmlns:a="http://schemas.openxmlformats.org/drawingml/2006/main">
+              <a:graphicData uri="http://schemas.openxmlformats.org/drawingml/2006/picture">
+                <pic:pic xmlns:pic="http://schemas.openxmlformats.org/drawingml/2006/picture">
+                  <pic:nvPicPr>
+                    <pic:cNvPr id="1" name=""/>
+                    <pic:cNvPicPr/>
+                  </pic:nvPicPr>
+                  <pic:blipFill>
+                    <a:blip r:embed="rId14"/>
+                    <a:stretch>
+                      <a:fillRect/>
+                    </a:stretch>
+                  </pic:blipFill>
+                  <pic:spPr>
+                    <a:xfrm>
+                      <a:off x="0" y="0"/>
+                      <a:ext cx="5834730" cy="5212676"/>
+                    </a:xfrm>
+                    <a:prstGeom prst="rect">
+                      <a:avLst/>
+                    </a:prstGeom>
+                  </pic:spPr>
+                </pic:pic>
+              </a:graphicData>
+            </a:graphic>
+          </wp:inline>
+        </w:drawing>
+      </w:r>
+      <w:bookmarkEnd w:id="0"/>
+    </w:p>
     <w:sectPr>
       <w:pgSz w:w="11900" w:h="16840"/>
       <w:pgMar w:top="240" w:right="566" w:bottom="280" w:left="566" w:header="720" w:footer="720" w:gutter="0"/>
@@ -9509,8 +9743,8 @@
 </file>
 
 <file path=word/numbering.xml><?xml version="1.0" encoding="utf-8"?>
-<w:numbering xmlns:wpc="http://schemas.microsoft.com/office/word/2010/wordprocessingCanvas" xmlns:cx="http://schemas.microsoft.com/office/drawing/2014/chartex" xmlns:cx1="http://schemas.microsoft.com/office/drawing/2015/9/8/chartex" xmlns:cx2="http://schemas.microsoft.com/office/drawing/2015/10/21/chartex" xmlns:cx3="http://schemas.microsoft.com/office/drawing/2016/5/9/chartex" xmlns:cx4="http://schemas.microsoft.com/office/drawing/2016/5/10/chartex" xmlns:cx5="http://schemas.microsoft.com/office/drawing/2016/5/11/chartex" xmlns:cx6="http://schemas.microsoft.com/office/drawing/2016/5/12/chartex" xmlns:cx7="http://schemas.microsoft.com/office/drawing/2016/5/13/chartex" xmlns:cx8="http://schemas.microsoft.com/office/drawing/2016/5/14/chartex" xmlns:mc="http://schemas.openxmlformats.org/markup-compatibility/2006" xmlns:aink="http://schemas.microsoft.com/office/drawing/2016/ink" xmlns:am3d="http://schemas.microsoft.com/office/drawing/2017/model3d" xmlns:o="urn:schemas-microsoft-com:office:office" xmlns:oel="http://schemas.microsoft.com/office/2019/extlst" xmlns:r="http://schemas.openxmlformats.org/officeDocument/2006/relationships" xmlns:m="http://schemas.openxmlformats.org/officeDocument/2006/math" xmlns:v="urn:schemas-microsoft-com:vml" xmlns:wp14="http://schemas.microsoft.com/office/word/2010/wordprocessingDrawing" xmlns:wp="http://schemas.openxmlformats.org/drawingml/2006/wordprocessingDrawing" xmlns:w10="urn:schemas-microsoft-com:office:word" xmlns:w="http://schemas.openxmlformats.org/wordprocessingml/2006/main" xmlns:w14="http://schemas.microsoft.com/office/word/2010/wordml" xmlns:w15="http://schemas.microsoft.com/office/word/2012/wordml" xmlns:w16cex="http://schemas.microsoft.com/office/word/2018/wordml/cex" xmlns:w16cid="http://schemas.microsoft.com/office/word/2016/wordml/cid" xmlns:w16="http://schemas.microsoft.com/office/word/2018/wordml" xmlns:w16du="http://schemas.microsoft.com/office/word/2023/wordml/word16du" xmlns:w16sdtdh="http://schemas.microsoft.com/office/word/2020/wordml/sdtdatahash" xmlns:w16sdtfl="http://schemas.microsoft.com/office/word/2024/wordml/sdtformatlock" xmlns:w16se="http://schemas.microsoft.com/office/word/2015/wordml/symex" xmlns:wpg="http://schemas.microsoft.com/office/word/2010/wordprocessingGroup" xmlns:wpi="http://schemas.microsoft.com/office/word/2010/wordprocessingInk" xmlns:wne="http://schemas.microsoft.com/office/word/2006/wordml" xmlns:wps="http://schemas.microsoft.com/office/word/2010/wordprocessingShape" mc:Ignorable="w14 w15 w16se w16cid w16 w16cex w16sdtdh w16sdtfl w16du wp14">
-  <w:abstractNum w:abstractNumId="0" w15:restartNumberingAfterBreak="0">
+<w:numbering xmlns:wpc="http://schemas.microsoft.com/office/word/2010/wordprocessingCanvas" xmlns:mc="http://schemas.openxmlformats.org/markup-compatibility/2006" xmlns:o="urn:schemas-microsoft-com:office:office" xmlns:r="http://schemas.openxmlformats.org/officeDocument/2006/relationships" xmlns:m="http://schemas.openxmlformats.org/officeDocument/2006/math" xmlns:v="urn:schemas-microsoft-com:vml" xmlns:wp14="http://schemas.microsoft.com/office/word/2010/wordprocessingDrawing" xmlns:wp="http://schemas.openxmlformats.org/drawingml/2006/wordprocessingDrawing" xmlns:w10="urn:schemas-microsoft-com:office:word" xmlns:w="http://schemas.openxmlformats.org/wordprocessingml/2006/main" xmlns:w14="http://schemas.microsoft.com/office/word/2010/wordml" xmlns:w15="http://schemas.microsoft.com/office/word/2012/wordml" xmlns:wpg="http://schemas.microsoft.com/office/word/2010/wordprocessingGroup" xmlns:wpi="http://schemas.microsoft.com/office/word/2010/wordprocessingInk" xmlns:wne="http://schemas.microsoft.com/office/word/2006/wordml" xmlns:wps="http://schemas.microsoft.com/office/word/2010/wordprocessingShape" mc:Ignorable="w14 w15 wp14">
+  <w:abstractNum w:abstractNumId="0">
     <w:nsid w:val="7C186587"/>
     <w:multiLevelType w:val="hybridMultilevel"/>
     <w:tmpl w:val="6360DADA"/>
@@ -9644,14 +9878,14 @@
       </w:rPr>
     </w:lvl>
   </w:abstractNum>
-  <w:num w:numId="1" w16cid:durableId="892884156">
+  <w:num w:numId="1">
     <w:abstractNumId w:val="0"/>
   </w:num>
 </w:numbering>
 </file>
 
 <file path=word/styles.xml><?xml version="1.0" encoding="utf-8"?>
-<w:styles xmlns:mc="http://schemas.openxmlformats.org/markup-compatibility/2006" xmlns:r="http://schemas.openxmlformats.org/officeDocument/2006/relationships" xmlns:w="http://schemas.openxmlformats.org/wordprocessingml/2006/main" xmlns:w14="http://schemas.microsoft.com/office/word/2010/wordml" xmlns:w15="http://schemas.microsoft.com/office/word/2012/wordml" xmlns:w16cex="http://schemas.microsoft.com/office/word/2018/wordml/cex" xmlns:w16cid="http://schemas.microsoft.com/office/word/2016/wordml/cid" xmlns:w16="http://schemas.microsoft.com/office/word/2018/wordml" xmlns:w16du="http://schemas.microsoft.com/office/word/2023/wordml/word16du" xmlns:w16sdtdh="http://schemas.microsoft.com/office/word/2020/wordml/sdtdatahash" xmlns:w16sdtfl="http://schemas.microsoft.com/office/word/2024/wordml/sdtformatlock" xmlns:w16se="http://schemas.microsoft.com/office/word/2015/wordml/symex" mc:Ignorable="w14 w15 w16se w16cid w16 w16cex w16sdtdh w16sdtfl w16du">
+<w:styles xmlns:mc="http://schemas.openxmlformats.org/markup-compatibility/2006" xmlns:r="http://schemas.openxmlformats.org/officeDocument/2006/relationships" xmlns:w="http://schemas.openxmlformats.org/wordprocessingml/2006/main" xmlns:w14="http://schemas.microsoft.com/office/word/2010/wordml" xmlns:w15="http://schemas.microsoft.com/office/word/2012/wordml" mc:Ignorable="w14 w15">
   <w:docDefaults>
     <w:rPrDefault>
       <w:rPr>
@@ -9669,7 +9903,7 @@
       </w:pPr>
     </w:pPrDefault>
   </w:docDefaults>
-  <w:latentStyles w:defLockedState="0" w:defUIPriority="99" w:defSemiHidden="0" w:defUnhideWhenUsed="0" w:defQFormat="0" w:count="376">
+  <w:latentStyles w:defLockedState="0" w:defUIPriority="99" w:defSemiHidden="0" w:defUnhideWhenUsed="0" w:defQFormat="0" w:count="371">
     <w:lsdException w:name="Normal" w:uiPriority="0" w:qFormat="1"/>
     <w:lsdException w:name="heading 1" w:uiPriority="9" w:qFormat="1"/>
     <w:lsdException w:name="heading 2" w:semiHidden="1" w:uiPriority="9" w:unhideWhenUsed="1" w:qFormat="1"/>
@@ -10041,11 +10275,6 @@
     <w:lsdException w:name="List Table 5 Dark Accent 6" w:uiPriority="50"/>
     <w:lsdException w:name="List Table 6 Colorful Accent 6" w:uiPriority="51"/>
     <w:lsdException w:name="List Table 7 Colorful Accent 6" w:uiPriority="52"/>
-    <w:lsdException w:name="Mention" w:semiHidden="1" w:unhideWhenUsed="1"/>
-    <w:lsdException w:name="Smart Hyperlink" w:semiHidden="1" w:unhideWhenUsed="1"/>
-    <w:lsdException w:name="Hashtag" w:semiHidden="1" w:unhideWhenUsed="1"/>
-    <w:lsdException w:name="Unresolved Mention" w:semiHidden="1" w:unhideWhenUsed="1"/>
-    <w:lsdException w:name="Smart Link" w:semiHidden="1" w:unhideWhenUsed="1"/>
   </w:latentStyles>
   <w:style w:type="paragraph" w:default="1" w:styleId="Normal">
     <w:name w:val="Normal"/>
@@ -10091,6 +10320,7 @@
   <w:style w:type="character" w:default="1" w:styleId="DefaultParagraphFont">
     <w:name w:val="Default Paragraph Font"/>
     <w:uiPriority w:val="1"/>
+    <w:semiHidden/>
     <w:unhideWhenUsed/>
   </w:style>
   <w:style w:type="table" w:default="1" w:styleId="TableNormal">
@@ -10446,4 +10676,16 @@
   <a:objectDefaults/>
   <a:extraClrSchemeLst/>
 </a:theme>
+</file>
+
+<file path=customXml/item1.xml><?xml version="1.0" encoding="utf-8"?>
+<b:Sources xmlns:b="http://schemas.openxmlformats.org/officeDocument/2006/bibliography" xmlns="http://schemas.openxmlformats.org/officeDocument/2006/bibliography" SelectedStyle="\APASixthEditionOfficeOnline.xsl" StyleName="APA" Version="6"/>
+</file>
+
+<file path=customXml/itemProps1.xml><?xml version="1.0" encoding="utf-8"?>
+<ds:datastoreItem xmlns:ds="http://schemas.openxmlformats.org/officeDocument/2006/customXml" ds:itemID="{0C24B6F4-66F4-4AFE-86B7-2F9CC7FFF838}">
+  <ds:schemaRefs>
+    <ds:schemaRef ds:uri="http://schemas.openxmlformats.org/officeDocument/2006/bibliography"/>
+  </ds:schemaRefs>
+</ds:datastoreItem>
 </file>
</xml_diff>

<commit_message>
added db schema in report section for refrence
</commit_message>
<xml_diff>
--- a/Reports/Report1.docx
+++ b/Reports/Report1.docx
@@ -1784,6 +1784,7 @@
         <w:ind w:left="634"/>
         <w:rPr>
           <w:rFonts w:asciiTheme="minorBidi" w:hAnsiTheme="minorBidi" w:cstheme="minorBidi"/>
+          <w:spacing w:val="-2"/>
         </w:rPr>
       </w:pPr>
       <w:proofErr w:type="gramStart"/>
@@ -1839,6 +1840,32 @@
           <w:spacing w:val="-2"/>
         </w:rPr>
         <w:t>authentication.</w:t>
+      </w:r>
+    </w:p>
+    <w:p>
+      <w:pPr>
+        <w:pStyle w:val="BodyText"/>
+        <w:spacing w:before="123"/>
+        <w:ind w:left="634"/>
+        <w:rPr>
+          <w:rFonts w:asciiTheme="minorBidi" w:hAnsiTheme="minorBidi" w:cstheme="minorBidi"/>
+        </w:rPr>
+      </w:pPr>
+      <w:bookmarkStart w:id="0" w:name="_GoBack"/>
+      <w:bookmarkEnd w:id="0"/>
+    </w:p>
+    <w:p>
+      <w:pPr>
+        <w:pStyle w:val="Heading1"/>
+        <w:rPr>
+          <w:rFonts w:asciiTheme="minorBidi" w:hAnsiTheme="minorBidi" w:cstheme="minorBidi"/>
+        </w:rPr>
+      </w:pPr>
+      <w:r>
+        <w:rPr>
+          <w:rFonts w:asciiTheme="minorBidi" w:hAnsiTheme="minorBidi" w:cstheme="minorBidi"/>
+        </w:rPr>
+        <w:t>Database Schema</w:t>
       </w:r>
     </w:p>
     <w:p>
@@ -1850,6 +1877,71 @@
           <w:rFonts w:asciiTheme="minorBidi" w:hAnsiTheme="minorBidi" w:cstheme="minorBidi"/>
         </w:rPr>
       </w:pPr>
+      <w:r>
+        <w:rPr>
+          <w:rFonts w:asciiTheme="minorBidi" w:hAnsiTheme="minorBidi" w:cstheme="minorBidi"/>
+          <w:noProof/>
+          <w:lang w:val="en-GB" w:eastAsia="en-GB"/>
+        </w:rPr>
+        <w:drawing>
+          <wp:inline distT="0" distB="0" distL="0" distR="0" wp14:anchorId="49360526" wp14:editId="4C9668E8">
+            <wp:extent cx="4739640" cy="4696683"/>
+            <wp:effectExtent l="0" t="0" r="3810" b="8890"/>
+            <wp:docPr id="7" name="Picture 7"/>
+            <wp:cNvGraphicFramePr>
+              <a:graphicFrameLocks xmlns:a="http://schemas.openxmlformats.org/drawingml/2006/main" noChangeAspect="1"/>
+            </wp:cNvGraphicFramePr>
+            <a:graphic xmlns:a="http://schemas.openxmlformats.org/drawingml/2006/main">
+              <a:graphicData uri="http://schemas.openxmlformats.org/drawingml/2006/picture">
+                <pic:pic xmlns:pic="http://schemas.openxmlformats.org/drawingml/2006/picture">
+                  <pic:nvPicPr>
+                    <pic:cNvPr id="0" name="Picture 1"/>
+                    <pic:cNvPicPr>
+                      <a:picLocks noChangeAspect="1" noChangeArrowheads="1"/>
+                    </pic:cNvPicPr>
+                  </pic:nvPicPr>
+                  <pic:blipFill>
+                    <a:blip r:embed="rId7">
+                      <a:extLst>
+                        <a:ext uri="{28A0092B-C50C-407E-A947-70E740481C1C}">
+                          <a14:useLocalDpi xmlns:a14="http://schemas.microsoft.com/office/drawing/2010/main" val="0"/>
+                        </a:ext>
+                      </a:extLst>
+                    </a:blip>
+                    <a:srcRect/>
+                    <a:stretch>
+                      <a:fillRect/>
+                    </a:stretch>
+                  </pic:blipFill>
+                  <pic:spPr bwMode="auto">
+                    <a:xfrm>
+                      <a:off x="0" y="0"/>
+                      <a:ext cx="4739953" cy="4696993"/>
+                    </a:xfrm>
+                    <a:prstGeom prst="rect">
+                      <a:avLst/>
+                    </a:prstGeom>
+                    <a:noFill/>
+                    <a:ln>
+                      <a:noFill/>
+                    </a:ln>
+                  </pic:spPr>
+                </pic:pic>
+              </a:graphicData>
+            </a:graphic>
+          </wp:inline>
+        </w:drawing>
+      </w:r>
+    </w:p>
+    <w:p>
+      <w:pPr>
+        <w:pStyle w:val="BodyText"/>
+        <w:spacing w:before="150"/>
+        <w:ind w:left="0"/>
+        <w:rPr>
+          <w:rFonts w:asciiTheme="minorBidi" w:hAnsiTheme="minorBidi" w:cstheme="minorBidi"/>
+        </w:rPr>
+      </w:pPr>
     </w:p>
     <w:p>
       <w:pPr>
@@ -1862,6 +1954,7 @@
         <w:rPr>
           <w:rFonts w:asciiTheme="minorBidi" w:hAnsiTheme="minorBidi" w:cstheme="minorBidi"/>
         </w:rPr>
+        <w:lastRenderedPageBreak/>
         <w:t>Singleton Design Pattern</w:t>
       </w:r>
     </w:p>
@@ -2863,7 +2956,7 @@
                     </pic:cNvPicPr>
                   </pic:nvPicPr>
                   <pic:blipFill>
-                    <a:blip r:embed="rId7">
+                    <a:blip r:embed="rId8">
                       <a:extLst>
                         <a:ext uri="{28A0092B-C50C-407E-A947-70E740481C1C}">
                           <a14:useLocalDpi xmlns:a14="http://schemas.microsoft.com/office/drawing/2010/main" val="0"/>
@@ -2961,7 +3054,6 @@
           <w:color w:val="455964"/>
           <w:w w:val="90"/>
         </w:rPr>
-        <w:lastRenderedPageBreak/>
         <w:t>Case</w:t>
       </w:r>
       <w:r>
@@ -4254,7 +4346,7 @@
                     </pic:cNvPicPr>
                   </pic:nvPicPr>
                   <pic:blipFill>
-                    <a:blip r:embed="rId8">
+                    <a:blip r:embed="rId9">
                       <a:extLst>
                         <a:ext uri="{28A0092B-C50C-407E-A947-70E740481C1C}">
                           <a14:useLocalDpi xmlns:a14="http://schemas.microsoft.com/office/drawing/2010/main" val="0"/>
@@ -4488,7 +4580,7 @@
               </wp:anchor>
             </w:drawing>
           </mc:Choice>
-          <mc:Fallback xmlns:w16se="http://schemas.microsoft.com/office/word/2015/wordml/symex" xmlns:w16sdtfl="http://schemas.microsoft.com/office/word/2024/wordml/sdtformatlock" xmlns:w16sdtdh="http://schemas.microsoft.com/office/word/2020/wordml/sdtdatahash" xmlns:w16du="http://schemas.microsoft.com/office/word/2023/wordml/word16du" xmlns:w16="http://schemas.microsoft.com/office/word/2018/wordml" xmlns:w16cid="http://schemas.microsoft.com/office/word/2016/wordml/cid" xmlns:w16cex="http://schemas.microsoft.com/office/word/2018/wordml/cex" xmlns:oel="http://schemas.microsoft.com/office/2019/extlst" xmlns:am3d="http://schemas.microsoft.com/office/drawing/2017/model3d" xmlns:aink="http://schemas.microsoft.com/office/drawing/2016/ink" xmlns:cx8="http://schemas.microsoft.com/office/drawing/2016/5/14/chartex" xmlns:cx7="http://schemas.microsoft.com/office/drawing/2016/5/13/chartex" xmlns:cx6="http://schemas.microsoft.com/office/drawing/2016/5/12/chartex" xmlns:cx5="http://schemas.microsoft.com/office/drawing/2016/5/11/chartex" xmlns:cx4="http://schemas.microsoft.com/office/drawing/2016/5/10/chartex" xmlns:cx3="http://schemas.microsoft.com/office/drawing/2016/5/9/chartex" xmlns:cx2="http://schemas.microsoft.com/office/drawing/2015/10/21/chartex" xmlns:cx1="http://schemas.microsoft.com/office/drawing/2015/9/8/chartex" xmlns:cx="http://schemas.microsoft.com/office/drawing/2014/chartex">
+          <mc:Fallback xmlns:cx="http://schemas.microsoft.com/office/drawing/2014/chartex" xmlns:cx1="http://schemas.microsoft.com/office/drawing/2015/9/8/chartex" xmlns:cx2="http://schemas.microsoft.com/office/drawing/2015/10/21/chartex" xmlns:cx3="http://schemas.microsoft.com/office/drawing/2016/5/9/chartex" xmlns:cx4="http://schemas.microsoft.com/office/drawing/2016/5/10/chartex" xmlns:cx5="http://schemas.microsoft.com/office/drawing/2016/5/11/chartex" xmlns:cx6="http://schemas.microsoft.com/office/drawing/2016/5/12/chartex" xmlns:cx7="http://schemas.microsoft.com/office/drawing/2016/5/13/chartex" xmlns:cx8="http://schemas.microsoft.com/office/drawing/2016/5/14/chartex" xmlns:aink="http://schemas.microsoft.com/office/drawing/2016/ink" xmlns:am3d="http://schemas.microsoft.com/office/drawing/2017/model3d" xmlns:oel="http://schemas.microsoft.com/office/2019/extlst" xmlns:w16cex="http://schemas.microsoft.com/office/word/2018/wordml/cex" xmlns:w16cid="http://schemas.microsoft.com/office/word/2016/wordml/cid" xmlns:w16="http://schemas.microsoft.com/office/word/2018/wordml" xmlns:w16du="http://schemas.microsoft.com/office/word/2023/wordml/word16du" xmlns:w16sdtdh="http://schemas.microsoft.com/office/word/2020/wordml/sdtdatahash" xmlns:w16sdtfl="http://schemas.microsoft.com/office/word/2024/wordml/sdtformatlock" xmlns:w16se="http://schemas.microsoft.com/office/word/2015/wordml/symex">
             <w:pict>
               <v:group w14:anchorId="62526F51" id="Group 8" o:spid="_x0000_s1026" style="position:absolute;margin-left:30pt;margin-top:14pt;width:535pt;height:1.55pt;z-index:-251660800;mso-wrap-distance-left:0;mso-wrap-distance-right:0;mso-position-horizontal-relative:page" coordsize="67945,196" o:gfxdata="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">
                 <v:shape id="Graphic 9" o:spid="_x0000_s1027" style="position:absolute;width:67945;height:95;visibility:visible;mso-wrap-style:square;v-text-anchor:top" coordsize="6794500,9525" o:gfxdata="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" path="m6794330,9529l,9529,,,6794330,r,9529xe" fillcolor="#999" stroked="f">
@@ -4665,6 +4757,7 @@
           <w:b/>
           <w:spacing w:val="-2"/>
         </w:rPr>
+        <w:lastRenderedPageBreak/>
         <w:t>Problem</w:t>
       </w:r>
       <w:r>
@@ -5913,7 +6006,7 @@
                     </pic:cNvPicPr>
                   </pic:nvPicPr>
                   <pic:blipFill>
-                    <a:blip r:embed="rId9">
+                    <a:blip r:embed="rId10">
                       <a:extLst>
                         <a:ext uri="{28A0092B-C50C-407E-A947-70E740481C1C}">
                           <a14:useLocalDpi xmlns:a14="http://schemas.microsoft.com/office/drawing/2010/main" val="0"/>
@@ -6156,7 +6249,7 @@
               </wp:anchor>
             </w:drawing>
           </mc:Choice>
-          <mc:Fallback xmlns:w16se="http://schemas.microsoft.com/office/word/2015/wordml/symex" xmlns:w16sdtfl="http://schemas.microsoft.com/office/word/2024/wordml/sdtformatlock" xmlns:w16sdtdh="http://schemas.microsoft.com/office/word/2020/wordml/sdtdatahash" xmlns:w16du="http://schemas.microsoft.com/office/word/2023/wordml/word16du" xmlns:w16="http://schemas.microsoft.com/office/word/2018/wordml" xmlns:w16cid="http://schemas.microsoft.com/office/word/2016/wordml/cid" xmlns:w16cex="http://schemas.microsoft.com/office/word/2018/wordml/cex" xmlns:oel="http://schemas.microsoft.com/office/2019/extlst" xmlns:am3d="http://schemas.microsoft.com/office/drawing/2017/model3d" xmlns:aink="http://schemas.microsoft.com/office/drawing/2016/ink" xmlns:cx8="http://schemas.microsoft.com/office/drawing/2016/5/14/chartex" xmlns:cx7="http://schemas.microsoft.com/office/drawing/2016/5/13/chartex" xmlns:cx6="http://schemas.microsoft.com/office/drawing/2016/5/12/chartex" xmlns:cx5="http://schemas.microsoft.com/office/drawing/2016/5/11/chartex" xmlns:cx4="http://schemas.microsoft.com/office/drawing/2016/5/10/chartex" xmlns:cx3="http://schemas.microsoft.com/office/drawing/2016/5/9/chartex" xmlns:cx2="http://schemas.microsoft.com/office/drawing/2015/10/21/chartex" xmlns:cx1="http://schemas.microsoft.com/office/drawing/2015/9/8/chartex" xmlns:cx="http://schemas.microsoft.com/office/drawing/2014/chartex">
+          <mc:Fallback xmlns:cx="http://schemas.microsoft.com/office/drawing/2014/chartex" xmlns:cx1="http://schemas.microsoft.com/office/drawing/2015/9/8/chartex" xmlns:cx2="http://schemas.microsoft.com/office/drawing/2015/10/21/chartex" xmlns:cx3="http://schemas.microsoft.com/office/drawing/2016/5/9/chartex" xmlns:cx4="http://schemas.microsoft.com/office/drawing/2016/5/10/chartex" xmlns:cx5="http://schemas.microsoft.com/office/drawing/2016/5/11/chartex" xmlns:cx6="http://schemas.microsoft.com/office/drawing/2016/5/12/chartex" xmlns:cx7="http://schemas.microsoft.com/office/drawing/2016/5/13/chartex" xmlns:cx8="http://schemas.microsoft.com/office/drawing/2016/5/14/chartex" xmlns:aink="http://schemas.microsoft.com/office/drawing/2016/ink" xmlns:am3d="http://schemas.microsoft.com/office/drawing/2017/model3d" xmlns:oel="http://schemas.microsoft.com/office/2019/extlst" xmlns:w16cex="http://schemas.microsoft.com/office/word/2018/wordml/cex" xmlns:w16cid="http://schemas.microsoft.com/office/word/2016/wordml/cid" xmlns:w16="http://schemas.microsoft.com/office/word/2018/wordml" xmlns:w16du="http://schemas.microsoft.com/office/word/2023/wordml/word16du" xmlns:w16sdtdh="http://schemas.microsoft.com/office/word/2020/wordml/sdtdatahash" xmlns:w16sdtfl="http://schemas.microsoft.com/office/word/2024/wordml/sdtformatlock" xmlns:w16se="http://schemas.microsoft.com/office/word/2015/wordml/symex">
             <w:pict>
               <v:group w14:anchorId="37DCD2DC" id="Group 12" o:spid="_x0000_s1026" style="position:absolute;margin-left:30pt;margin-top:14.05pt;width:535pt;height:1.55pt;z-index:-251658752;mso-wrap-distance-left:0;mso-wrap-distance-right:0;mso-position-horizontal-relative:page" coordsize="67945,196" o:gfxdata="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">
                 <v:shape id="Graphic 13" o:spid="_x0000_s1027" style="position:absolute;width:67945;height:95;visibility:visible;mso-wrap-style:square;v-text-anchor:top" coordsize="6794500,9525" o:gfxdata="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" path="m6794330,9529l,9529,,,6794330,r,9529xe" fillcolor="#999" stroked="f">
@@ -7567,6 +7660,7 @@
           <w:rFonts w:asciiTheme="minorBidi" w:hAnsiTheme="minorBidi" w:cstheme="minorBidi"/>
           <w:noProof/>
         </w:rPr>
+        <w:lastRenderedPageBreak/>
         <w:drawing>
           <wp:inline distT="0" distB="0" distL="0" distR="0" wp14:anchorId="4AE895D4" wp14:editId="57C8CC5E">
             <wp:extent cx="6164580" cy="2309157"/>
@@ -7585,7 +7679,7 @@
                     </pic:cNvPicPr>
                   </pic:nvPicPr>
                   <pic:blipFill>
-                    <a:blip r:embed="rId10">
+                    <a:blip r:embed="rId11">
                       <a:extLst>
                         <a:ext uri="{28A0092B-C50C-407E-A947-70E740481C1C}">
                           <a14:useLocalDpi xmlns:a14="http://schemas.microsoft.com/office/drawing/2010/main" val="0"/>
@@ -8626,7 +8720,6 @@
           <w:rFonts w:asciiTheme="minorBidi" w:hAnsiTheme="minorBidi" w:cstheme="minorBidi"/>
           <w:noProof/>
         </w:rPr>
-        <w:lastRenderedPageBreak/>
         <w:drawing>
           <wp:inline distT="0" distB="0" distL="0" distR="0" wp14:anchorId="4D5510A2" wp14:editId="536BF290">
             <wp:extent cx="5903196" cy="2438400"/>
@@ -8645,7 +8738,7 @@
                     </pic:cNvPicPr>
                   </pic:nvPicPr>
                   <pic:blipFill>
-                    <a:blip r:embed="rId11">
+                    <a:blip r:embed="rId12">
                       <a:extLst>
                         <a:ext uri="{28A0092B-C50C-407E-A947-70E740481C1C}">
                           <a14:useLocalDpi xmlns:a14="http://schemas.microsoft.com/office/drawing/2010/main" val="0"/>
@@ -9609,54 +9702,16 @@
       <w:r>
         <w:rPr>
           <w:rFonts w:asciiTheme="minorBidi" w:hAnsiTheme="minorBidi" w:cstheme="minorBidi"/>
-          <w:sz w:val="24"/>
-        </w:rPr>
+          <w:noProof/>
+          <w:sz w:val="24"/>
+          <w:lang w:val="en-GB" w:eastAsia="en-GB"/>
+        </w:rPr>
+        <w:lastRenderedPageBreak/>
         <w:drawing>
           <wp:inline distT="0" distB="0" distL="0" distR="0" wp14:anchorId="30F555EE" wp14:editId="4DD7106E">
             <wp:extent cx="5793740" cy="3618397"/>
             <wp:effectExtent l="0" t="0" r="0" b="1270"/>
             <wp:docPr id="4" name="Picture 4"/>
-            <wp:cNvGraphicFramePr>
-              <a:graphicFrameLocks xmlns:a="http://schemas.openxmlformats.org/drawingml/2006/main" noChangeAspect="1"/>
-            </wp:cNvGraphicFramePr>
-            <a:graphic xmlns:a="http://schemas.openxmlformats.org/drawingml/2006/main">
-              <a:graphicData uri="http://schemas.openxmlformats.org/drawingml/2006/picture">
-                <pic:pic xmlns:pic="http://schemas.openxmlformats.org/drawingml/2006/picture">
-                  <pic:nvPicPr>
-                    <pic:cNvPr id="1" name=""/>
-                    <pic:cNvPicPr/>
-                  </pic:nvPicPr>
-                  <pic:blipFill>
-                    <a:blip r:embed="rId12"/>
-                    <a:stretch>
-                      <a:fillRect/>
-                    </a:stretch>
-                  </pic:blipFill>
-                  <pic:spPr>
-                    <a:xfrm>
-                      <a:off x="0" y="0"/>
-                      <a:ext cx="5798856" cy="3621592"/>
-                    </a:xfrm>
-                    <a:prstGeom prst="rect">
-                      <a:avLst/>
-                    </a:prstGeom>
-                  </pic:spPr>
-                </pic:pic>
-              </a:graphicData>
-            </a:graphic>
-          </wp:inline>
-        </w:drawing>
-      </w:r>
-      <w:r>
-        <w:rPr>
-          <w:rFonts w:asciiTheme="minorBidi" w:hAnsiTheme="minorBidi" w:cstheme="minorBidi"/>
-          <w:sz w:val="24"/>
-        </w:rPr>
-        <w:drawing>
-          <wp:inline distT="0" distB="0" distL="0" distR="0" wp14:anchorId="240A1234" wp14:editId="4E76C23E">
-            <wp:extent cx="5801360" cy="982697"/>
-            <wp:effectExtent l="0" t="0" r="0" b="8255"/>
-            <wp:docPr id="5" name="Picture 5"/>
             <wp:cNvGraphicFramePr>
               <a:graphicFrameLocks xmlns:a="http://schemas.openxmlformats.org/drawingml/2006/main" noChangeAspect="1"/>
             </wp:cNvGraphicFramePr>
@@ -9676,7 +9731,7 @@
                   <pic:spPr>
                     <a:xfrm>
                       <a:off x="0" y="0"/>
-                      <a:ext cx="5867875" cy="993964"/>
+                      <a:ext cx="5798856" cy="3621592"/>
                     </a:xfrm>
                     <a:prstGeom prst="rect">
                       <a:avLst/>
@@ -9688,18 +9743,18 @@
           </wp:inline>
         </w:drawing>
       </w:r>
-      <w:bookmarkStart w:id="0" w:name="_GoBack"/>
-      <w:r>
-        <w:rPr>
-          <w:rFonts w:asciiTheme="minorBidi" w:hAnsiTheme="minorBidi" w:cstheme="minorBidi"/>
-          <w:sz w:val="24"/>
-        </w:rPr>
-        <w:lastRenderedPageBreak/>
+      <w:r>
+        <w:rPr>
+          <w:rFonts w:asciiTheme="minorBidi" w:hAnsiTheme="minorBidi" w:cstheme="minorBidi"/>
+          <w:noProof/>
+          <w:sz w:val="24"/>
+          <w:lang w:val="en-GB" w:eastAsia="en-GB"/>
+        </w:rPr>
         <w:drawing>
-          <wp:inline distT="0" distB="0" distL="0" distR="0" wp14:anchorId="2EA015EA" wp14:editId="7B1A5CDC">
-            <wp:extent cx="5818425" cy="5198110"/>
-            <wp:effectExtent l="0" t="0" r="0" b="2540"/>
-            <wp:docPr id="6" name="Picture 6"/>
+          <wp:inline distT="0" distB="0" distL="0" distR="0" wp14:anchorId="240A1234" wp14:editId="4E76C23E">
+            <wp:extent cx="5801360" cy="982697"/>
+            <wp:effectExtent l="0" t="0" r="0" b="8255"/>
+            <wp:docPr id="5" name="Picture 5"/>
             <wp:cNvGraphicFramePr>
               <a:graphicFrameLocks xmlns:a="http://schemas.openxmlformats.org/drawingml/2006/main" noChangeAspect="1"/>
             </wp:cNvGraphicFramePr>
@@ -9719,6 +9774,49 @@
                   <pic:spPr>
                     <a:xfrm>
                       <a:off x="0" y="0"/>
+                      <a:ext cx="5867875" cy="993964"/>
+                    </a:xfrm>
+                    <a:prstGeom prst="rect">
+                      <a:avLst/>
+                    </a:prstGeom>
+                  </pic:spPr>
+                </pic:pic>
+              </a:graphicData>
+            </a:graphic>
+          </wp:inline>
+        </w:drawing>
+      </w:r>
+      <w:r>
+        <w:rPr>
+          <w:rFonts w:asciiTheme="minorBidi" w:hAnsiTheme="minorBidi" w:cstheme="minorBidi"/>
+          <w:noProof/>
+          <w:sz w:val="24"/>
+          <w:lang w:val="en-GB" w:eastAsia="en-GB"/>
+        </w:rPr>
+        <w:drawing>
+          <wp:inline distT="0" distB="0" distL="0" distR="0" wp14:anchorId="2EA015EA" wp14:editId="7B1A5CDC">
+            <wp:extent cx="5818425" cy="5198110"/>
+            <wp:effectExtent l="0" t="0" r="0" b="2540"/>
+            <wp:docPr id="6" name="Picture 6"/>
+            <wp:cNvGraphicFramePr>
+              <a:graphicFrameLocks xmlns:a="http://schemas.openxmlformats.org/drawingml/2006/main" noChangeAspect="1"/>
+            </wp:cNvGraphicFramePr>
+            <a:graphic xmlns:a="http://schemas.openxmlformats.org/drawingml/2006/main">
+              <a:graphicData uri="http://schemas.openxmlformats.org/drawingml/2006/picture">
+                <pic:pic xmlns:pic="http://schemas.openxmlformats.org/drawingml/2006/picture">
+                  <pic:nvPicPr>
+                    <pic:cNvPr id="1" name=""/>
+                    <pic:cNvPicPr/>
+                  </pic:nvPicPr>
+                  <pic:blipFill>
+                    <a:blip r:embed="rId15"/>
+                    <a:stretch>
+                      <a:fillRect/>
+                    </a:stretch>
+                  </pic:blipFill>
+                  <pic:spPr>
+                    <a:xfrm>
+                      <a:off x="0" y="0"/>
                       <a:ext cx="5834730" cy="5212676"/>
                     </a:xfrm>
                     <a:prstGeom prst="rect">
@@ -9731,7 +9829,6 @@
           </wp:inline>
         </w:drawing>
       </w:r>
-      <w:bookmarkEnd w:id="0"/>
     </w:p>
     <w:sectPr>
       <w:pgSz w:w="11900" w:h="16840"/>
@@ -10683,7 +10780,7 @@
 </file>
 
 <file path=customXml/itemProps1.xml><?xml version="1.0" encoding="utf-8"?>
-<ds:datastoreItem xmlns:ds="http://schemas.openxmlformats.org/officeDocument/2006/customXml" ds:itemID="{0C24B6F4-66F4-4AFE-86B7-2F9CC7FFF838}">
+<ds:datastoreItem xmlns:ds="http://schemas.openxmlformats.org/officeDocument/2006/customXml" ds:itemID="{5CDE40FD-651E-4EE8-B498-42F103CA7D93}">
   <ds:schemaRefs>
     <ds:schemaRef ds:uri="http://schemas.openxmlformats.org/officeDocument/2006/bibliography"/>
   </ds:schemaRefs>

</xml_diff>